<commit_message>
Fase 2 - Assets
</commit_message>
<xml_diff>
--- a/Documentação/Roteiro de Fases/Fase 2.1.docx
+++ b/Documentação/Roteiro de Fases/Fase 2.1.docx
@@ -8,6 +8,8 @@
         <w:jc w:val="both"/>
         <w:rPr>
           <w:rFonts w:ascii="Goudy Type" w:eastAsia="Goudy Type" w:hAnsi="Goudy Type" w:cs="Goudy Type"/>
+          <w:b/>
+          <w:bCs/>
           <w:sz w:val="28"/>
           <w:szCs w:val="28"/>
         </w:rPr>
@@ -22,6 +24,17 @@
         </w:rPr>
         <w:t>Fase 2.1: Corrida do Ouro na Califórnia (Sierra Nevada, EUA)</w:t>
       </w:r>
+    </w:p>
+    <w:p>
+      <w:pPr>
+        <w:spacing w:after="0" w:line="240" w:lineRule="auto"/>
+        <w:jc w:val="both"/>
+        <w:rPr>
+          <w:rFonts w:ascii="Goudy Type" w:eastAsia="Goudy Type" w:hAnsi="Goudy Type" w:cs="Goudy Type"/>
+          <w:sz w:val="28"/>
+          <w:szCs w:val="28"/>
+        </w:rPr>
+      </w:pPr>
     </w:p>
     <w:p>
       <w:pPr>
@@ -283,6 +296,7 @@
           <w:sz w:val="28"/>
           <w:szCs w:val="28"/>
         </w:rPr>
+        <w:lastRenderedPageBreak/>
         <w:t>Cena 1: Início</w:t>
       </w:r>
     </w:p>
@@ -302,7 +316,6 @@
           <w:b/>
           <w:bCs/>
         </w:rPr>
-        <w:lastRenderedPageBreak/>
         <w:t xml:space="preserve">Visual: </w:t>
       </w:r>
       <w:r>
@@ -359,7 +372,13 @@
         <w:rPr>
           <w:rFonts w:ascii="Arial" w:eastAsia="Arial" w:hAnsi="Arial" w:cs="Arial"/>
         </w:rPr>
-        <w:t>Corvan percorre a margem do rio procurando suas ferramentas: Bateia e Picareta.</w:t>
+        <w:t>Bateia e Picareta.</w:t>
+      </w:r>
+      <w:r>
+        <w:rPr>
+          <w:rFonts w:ascii="Arial" w:eastAsia="Arial" w:hAnsi="Arial" w:cs="Arial"/>
+        </w:rPr>
+        <w:t xml:space="preserve"> (Já coletas na Fase 1)</w:t>
       </w:r>
     </w:p>
     <w:p>
@@ -891,13 +910,13 @@
         <w:tblLook w:val="0000" w:firstRow="0" w:lastRow="0" w:firstColumn="0" w:lastColumn="0" w:noHBand="0" w:noVBand="0"/>
       </w:tblPr>
       <w:tblGrid>
-        <w:gridCol w:w="4680"/>
-        <w:gridCol w:w="4680"/>
+        <w:gridCol w:w="3118"/>
+        <w:gridCol w:w="6242"/>
       </w:tblGrid>
       <w:tr>
         <w:tc>
           <w:tcPr>
-            <w:tcW w:w="4680" w:type="dxa"/>
+            <w:tcW w:w="3118" w:type="dxa"/>
             <w:tcBorders>
               <w:top w:val="single" w:sz="1" w:space="0" w:color="CCCCCC"/>
               <w:left w:val="single" w:sz="1" w:space="0" w:color="CCCCCC"/>
@@ -925,7 +944,7 @@
         </w:tc>
         <w:tc>
           <w:tcPr>
-            <w:tcW w:w="4680" w:type="dxa"/>
+            <w:tcW w:w="6242" w:type="dxa"/>
             <w:tcBorders>
               <w:top w:val="single" w:sz="1" w:space="0" w:color="CCCCCC"/>
               <w:left w:val="single" w:sz="1" w:space="0" w:color="CCCCCC"/>
@@ -955,7 +974,7 @@
       <w:tr>
         <w:tc>
           <w:tcPr>
-            <w:tcW w:w="4680" w:type="dxa"/>
+            <w:tcW w:w="3118" w:type="dxa"/>
             <w:tcBorders>
               <w:top w:val="single" w:sz="1" w:space="0" w:color="CCCCCC"/>
               <w:left w:val="single" w:sz="1" w:space="0" w:color="CCCCCC"/>
@@ -982,7 +1001,7 @@
         </w:tc>
         <w:tc>
           <w:tcPr>
-            <w:tcW w:w="4680" w:type="dxa"/>
+            <w:tcW w:w="6242" w:type="dxa"/>
             <w:tcBorders>
               <w:top w:val="single" w:sz="1" w:space="0" w:color="CCCCCC"/>
               <w:left w:val="single" w:sz="1" w:space="0" w:color="CCCCCC"/>
@@ -996,13 +1015,17 @@
               <w:right w:w="120" w:type="dxa"/>
             </w:tcMar>
           </w:tcPr>
-          <w:p/>
+          <w:p>
+            <w:r>
+              <w:t>OK</w:t>
+            </w:r>
+          </w:p>
         </w:tc>
       </w:tr>
       <w:tr>
         <w:tc>
           <w:tcPr>
-            <w:tcW w:w="4680" w:type="dxa"/>
+            <w:tcW w:w="3118" w:type="dxa"/>
             <w:tcBorders>
               <w:top w:val="single" w:sz="1" w:space="0" w:color="CCCCCC"/>
               <w:left w:val="single" w:sz="1" w:space="0" w:color="CCCCCC"/>
@@ -1029,7 +1052,7 @@
         </w:tc>
         <w:tc>
           <w:tcPr>
-            <w:tcW w:w="4680" w:type="dxa"/>
+            <w:tcW w:w="6242" w:type="dxa"/>
             <w:tcBorders>
               <w:top w:val="single" w:sz="1" w:space="0" w:color="CCCCCC"/>
               <w:left w:val="single" w:sz="1" w:space="0" w:color="CCCCCC"/>
@@ -1043,13 +1066,17 @@
               <w:right w:w="120" w:type="dxa"/>
             </w:tcMar>
           </w:tcPr>
-          <w:p/>
+          <w:p>
+            <w:r>
+              <w:t>OK</w:t>
+            </w:r>
+          </w:p>
         </w:tc>
       </w:tr>
       <w:tr>
         <w:tc>
           <w:tcPr>
-            <w:tcW w:w="4680" w:type="dxa"/>
+            <w:tcW w:w="3118" w:type="dxa"/>
             <w:tcBorders>
               <w:top w:val="single" w:sz="1" w:space="0" w:color="CCCCCC"/>
               <w:left w:val="single" w:sz="1" w:space="0" w:color="CCCCCC"/>
@@ -1077,7 +1104,7 @@
         </w:tc>
         <w:tc>
           <w:tcPr>
-            <w:tcW w:w="4680" w:type="dxa"/>
+            <w:tcW w:w="6242" w:type="dxa"/>
             <w:tcBorders>
               <w:top w:val="single" w:sz="1" w:space="0" w:color="CCCCCC"/>
               <w:left w:val="single" w:sz="1" w:space="0" w:color="CCCCCC"/>
@@ -1091,13 +1118,17 @@
               <w:right w:w="120" w:type="dxa"/>
             </w:tcMar>
           </w:tcPr>
-          <w:p/>
+          <w:p>
+            <w:r>
+              <w:t>OK</w:t>
+            </w:r>
+          </w:p>
         </w:tc>
       </w:tr>
       <w:tr>
         <w:tc>
           <w:tcPr>
-            <w:tcW w:w="4680" w:type="dxa"/>
+            <w:tcW w:w="3118" w:type="dxa"/>
             <w:tcBorders>
               <w:top w:val="single" w:sz="1" w:space="0" w:color="CCCCCC"/>
               <w:left w:val="single" w:sz="1" w:space="0" w:color="CCCCCC"/>
@@ -1124,7 +1155,7 @@
         </w:tc>
         <w:tc>
           <w:tcPr>
-            <w:tcW w:w="4680" w:type="dxa"/>
+            <w:tcW w:w="6242" w:type="dxa"/>
             <w:tcBorders>
               <w:top w:val="single" w:sz="1" w:space="0" w:color="CCCCCC"/>
               <w:left w:val="single" w:sz="1" w:space="0" w:color="CCCCCC"/>
@@ -1138,13 +1169,17 @@
               <w:right w:w="120" w:type="dxa"/>
             </w:tcMar>
           </w:tcPr>
-          <w:p/>
+          <w:p>
+            <w:r>
+              <w:t>OK</w:t>
+            </w:r>
+          </w:p>
         </w:tc>
       </w:tr>
       <w:tr>
         <w:tc>
           <w:tcPr>
-            <w:tcW w:w="4680" w:type="dxa"/>
+            <w:tcW w:w="3118" w:type="dxa"/>
             <w:tcBorders>
               <w:top w:val="single" w:sz="1" w:space="0" w:color="CCCCCC"/>
               <w:left w:val="single" w:sz="1" w:space="0" w:color="CCCCCC"/>
@@ -1171,7 +1206,7 @@
         </w:tc>
         <w:tc>
           <w:tcPr>
-            <w:tcW w:w="4680" w:type="dxa"/>
+            <w:tcW w:w="6242" w:type="dxa"/>
             <w:tcBorders>
               <w:top w:val="single" w:sz="1" w:space="0" w:color="CCCCCC"/>
               <w:left w:val="single" w:sz="1" w:space="0" w:color="CCCCCC"/>
@@ -1185,13 +1220,133 @@
               <w:right w:w="120" w:type="dxa"/>
             </w:tcMar>
           </w:tcPr>
-          <w:p/>
+          <w:p>
+            <w:r>
+              <w:t>OK - Usar como referência apenas, construir em html</w:t>
+            </w:r>
+          </w:p>
         </w:tc>
       </w:tr>
       <w:tr>
         <w:tc>
           <w:tcPr>
-            <w:tcW w:w="4680" w:type="dxa"/>
+            <w:tcW w:w="3118" w:type="dxa"/>
+            <w:tcBorders>
+              <w:top w:val="single" w:sz="1" w:space="0" w:color="CCCCCC"/>
+              <w:left w:val="single" w:sz="1" w:space="0" w:color="CCCCCC"/>
+              <w:bottom w:val="single" w:sz="1" w:space="0" w:color="CCCCCC"/>
+              <w:right w:val="single" w:sz="1" w:space="0" w:color="CCCCCC"/>
+            </w:tcBorders>
+            <w:tcMar>
+              <w:top w:w="80" w:type="dxa"/>
+              <w:left w:w="120" w:type="dxa"/>
+              <w:bottom w:w="80" w:type="dxa"/>
+              <w:right w:w="120" w:type="dxa"/>
+            </w:tcMar>
+          </w:tcPr>
+          <w:p>
+            <w:pPr>
+              <w:rPr>
+                <w:rFonts w:ascii="Arial" w:eastAsia="Arial" w:hAnsi="Arial" w:cs="Arial"/>
+                <w:b/>
+                <w:bCs/>
+              </w:rPr>
+            </w:pPr>
+            <w:r>
+              <w:rPr>
+                <w:rFonts w:ascii="Arial" w:eastAsia="Arial" w:hAnsi="Arial" w:cs="Arial"/>
+                <w:b/>
+                <w:bCs/>
+              </w:rPr>
+              <w:t>Pedra de Toque</w:t>
+            </w:r>
+          </w:p>
+        </w:tc>
+        <w:tc>
+          <w:tcPr>
+            <w:tcW w:w="6242" w:type="dxa"/>
+            <w:tcBorders>
+              <w:top w:val="single" w:sz="1" w:space="0" w:color="CCCCCC"/>
+              <w:left w:val="single" w:sz="1" w:space="0" w:color="CCCCCC"/>
+              <w:bottom w:val="single" w:sz="1" w:space="0" w:color="CCCCCC"/>
+              <w:right w:val="single" w:sz="1" w:space="0" w:color="CCCCCC"/>
+            </w:tcBorders>
+            <w:tcMar>
+              <w:top w:w="80" w:type="dxa"/>
+              <w:left w:w="120" w:type="dxa"/>
+              <w:bottom w:w="80" w:type="dxa"/>
+              <w:right w:w="120" w:type="dxa"/>
+            </w:tcMar>
+          </w:tcPr>
+          <w:p>
+            <w:r>
+              <w:t>OK - Usar como referência apenas, construir em html</w:t>
+            </w:r>
+          </w:p>
+        </w:tc>
+      </w:tr>
+      <w:tr>
+        <w:tc>
+          <w:tcPr>
+            <w:tcW w:w="3118" w:type="dxa"/>
+            <w:tcBorders>
+              <w:top w:val="single" w:sz="1" w:space="0" w:color="CCCCCC"/>
+              <w:left w:val="single" w:sz="1" w:space="0" w:color="CCCCCC"/>
+              <w:bottom w:val="single" w:sz="1" w:space="0" w:color="CCCCCC"/>
+              <w:right w:val="single" w:sz="1" w:space="0" w:color="CCCCCC"/>
+            </w:tcBorders>
+            <w:tcMar>
+              <w:top w:w="80" w:type="dxa"/>
+              <w:left w:w="120" w:type="dxa"/>
+              <w:bottom w:w="80" w:type="dxa"/>
+              <w:right w:w="120" w:type="dxa"/>
+            </w:tcMar>
+          </w:tcPr>
+          <w:p>
+            <w:pPr>
+              <w:rPr>
+                <w:rFonts w:ascii="Arial" w:eastAsia="Arial" w:hAnsi="Arial" w:cs="Arial"/>
+                <w:b/>
+                <w:bCs/>
+              </w:rPr>
+            </w:pPr>
+            <w:r>
+              <w:rPr>
+                <w:rFonts w:ascii="Arial" w:eastAsia="Arial" w:hAnsi="Arial" w:cs="Arial"/>
+                <w:b/>
+                <w:bCs/>
+              </w:rPr>
+              <w:t>Placa de Reivindicação</w:t>
+            </w:r>
+          </w:p>
+        </w:tc>
+        <w:tc>
+          <w:tcPr>
+            <w:tcW w:w="6242" w:type="dxa"/>
+            <w:tcBorders>
+              <w:top w:val="single" w:sz="1" w:space="0" w:color="CCCCCC"/>
+              <w:left w:val="single" w:sz="1" w:space="0" w:color="CCCCCC"/>
+              <w:bottom w:val="single" w:sz="1" w:space="0" w:color="CCCCCC"/>
+              <w:right w:val="single" w:sz="1" w:space="0" w:color="CCCCCC"/>
+            </w:tcBorders>
+            <w:tcMar>
+              <w:top w:w="80" w:type="dxa"/>
+              <w:left w:w="120" w:type="dxa"/>
+              <w:bottom w:w="80" w:type="dxa"/>
+              <w:right w:w="120" w:type="dxa"/>
+            </w:tcMar>
+          </w:tcPr>
+          <w:p>
+            <w:r>
+              <w:t>OK - Usar como referência apenas, construir em html</w:t>
+            </w:r>
+          </w:p>
+        </w:tc>
+      </w:tr>
+      <w:tr>
+        <w:tc>
+          <w:tcPr>
+            <w:tcW w:w="3118" w:type="dxa"/>
             <w:tcBorders>
               <w:top w:val="single" w:sz="1" w:space="0" w:color="CCCCCC"/>
               <w:left w:val="single" w:sz="1" w:space="0" w:color="CCCCCC"/>
@@ -1218,7 +1373,7 @@
         </w:tc>
         <w:tc>
           <w:tcPr>
-            <w:tcW w:w="4680" w:type="dxa"/>
+            <w:tcW w:w="6242" w:type="dxa"/>
             <w:tcBorders>
               <w:top w:val="single" w:sz="1" w:space="0" w:color="CCCCCC"/>
               <w:left w:val="single" w:sz="1" w:space="0" w:color="CCCCCC"/>
@@ -1232,13 +1387,17 @@
               <w:right w:w="120" w:type="dxa"/>
             </w:tcMar>
           </w:tcPr>
-          <w:p/>
+          <w:p>
+            <w:r>
+              <w:t>Conforme fase 1-2</w:t>
+            </w:r>
+          </w:p>
         </w:tc>
       </w:tr>
       <w:tr>
         <w:tc>
           <w:tcPr>
-            <w:tcW w:w="4680" w:type="dxa"/>
+            <w:tcW w:w="3118" w:type="dxa"/>
             <w:tcBorders>
               <w:top w:val="single" w:sz="1" w:space="0" w:color="CCCCCC"/>
               <w:left w:val="single" w:sz="1" w:space="0" w:color="CCCCCC"/>
@@ -1265,27 +1424,7 @@
         </w:tc>
         <w:tc>
           <w:tcPr>
-            <w:tcW w:w="4680" w:type="dxa"/>
-            <w:tcBorders>
-              <w:top w:val="single" w:sz="1" w:space="0" w:color="CCCCCC"/>
-              <w:left w:val="single" w:sz="1" w:space="0" w:color="CCCCCC"/>
-              <w:bottom w:val="single" w:sz="1" w:space="0" w:color="CCCCCC"/>
-              <w:right w:val="single" w:sz="1" w:space="0" w:color="CCCCCC"/>
-            </w:tcBorders>
-            <w:tcMar>
-              <w:top w:w="80" w:type="dxa"/>
-              <w:left w:w="120" w:type="dxa"/>
-              <w:bottom w:w="80" w:type="dxa"/>
-              <w:right w:w="120" w:type="dxa"/>
-            </w:tcMar>
-          </w:tcPr>
-          <w:p/>
-        </w:tc>
-      </w:tr>
-      <w:tr>
-        <w:tc>
-          <w:tcPr>
-            <w:tcW w:w="4680" w:type="dxa"/>
+            <w:tcW w:w="6242" w:type="dxa"/>
             <w:tcBorders>
               <w:top w:val="single" w:sz="1" w:space="0" w:color="CCCCCC"/>
               <w:left w:val="single" w:sz="1" w:space="0" w:color="CCCCCC"/>
@@ -1301,79 +1440,9 @@
           </w:tcPr>
           <w:p>
             <w:r>
-              <w:rPr>
-                <w:rFonts w:ascii="Arial" w:eastAsia="Arial" w:hAnsi="Arial" w:cs="Arial"/>
-                <w:b/>
-                <w:bCs/>
-              </w:rPr>
-              <w:t>Pedra de Toque</w:t>
+              <w:t>Conforme fase 1-1</w:t>
             </w:r>
           </w:p>
-        </w:tc>
-        <w:tc>
-          <w:tcPr>
-            <w:tcW w:w="4680" w:type="dxa"/>
-            <w:tcBorders>
-              <w:top w:val="single" w:sz="1" w:space="0" w:color="CCCCCC"/>
-              <w:left w:val="single" w:sz="1" w:space="0" w:color="CCCCCC"/>
-              <w:bottom w:val="single" w:sz="1" w:space="0" w:color="CCCCCC"/>
-              <w:right w:val="single" w:sz="1" w:space="0" w:color="CCCCCC"/>
-            </w:tcBorders>
-            <w:tcMar>
-              <w:top w:w="80" w:type="dxa"/>
-              <w:left w:w="120" w:type="dxa"/>
-              <w:bottom w:w="80" w:type="dxa"/>
-              <w:right w:w="120" w:type="dxa"/>
-            </w:tcMar>
-          </w:tcPr>
-          <w:p/>
-        </w:tc>
-      </w:tr>
-      <w:tr>
-        <w:tc>
-          <w:tcPr>
-            <w:tcW w:w="4680" w:type="dxa"/>
-            <w:tcBorders>
-              <w:top w:val="single" w:sz="1" w:space="0" w:color="CCCCCC"/>
-              <w:left w:val="single" w:sz="1" w:space="0" w:color="CCCCCC"/>
-              <w:bottom w:val="single" w:sz="1" w:space="0" w:color="CCCCCC"/>
-              <w:right w:val="single" w:sz="1" w:space="0" w:color="CCCCCC"/>
-            </w:tcBorders>
-            <w:tcMar>
-              <w:top w:w="80" w:type="dxa"/>
-              <w:left w:w="120" w:type="dxa"/>
-              <w:bottom w:w="80" w:type="dxa"/>
-              <w:right w:w="120" w:type="dxa"/>
-            </w:tcMar>
-          </w:tcPr>
-          <w:p>
-            <w:r>
-              <w:rPr>
-                <w:rFonts w:ascii="Arial" w:eastAsia="Arial" w:hAnsi="Arial" w:cs="Arial"/>
-                <w:b/>
-                <w:bCs/>
-              </w:rPr>
-              <w:t>Placa de Reivindicação</w:t>
-            </w:r>
-          </w:p>
-        </w:tc>
-        <w:tc>
-          <w:tcPr>
-            <w:tcW w:w="4680" w:type="dxa"/>
-            <w:tcBorders>
-              <w:top w:val="single" w:sz="1" w:space="0" w:color="CCCCCC"/>
-              <w:left w:val="single" w:sz="1" w:space="0" w:color="CCCCCC"/>
-              <w:bottom w:val="single" w:sz="1" w:space="0" w:color="CCCCCC"/>
-              <w:right w:val="single" w:sz="1" w:space="0" w:color="CCCCCC"/>
-            </w:tcBorders>
-            <w:tcMar>
-              <w:top w:w="80" w:type="dxa"/>
-              <w:left w:w="120" w:type="dxa"/>
-              <w:bottom w:w="80" w:type="dxa"/>
-              <w:right w:w="120" w:type="dxa"/>
-            </w:tcMar>
-          </w:tcPr>
-          <w:p/>
         </w:tc>
       </w:tr>
     </w:tbl>
@@ -8164,15 +8233,6 @@
   </w:num>
   <w:num w:numId="50" w16cid:durableId="1809546420">
     <w:abstractNumId w:val="32"/>
-    <w:lvlOverride w:ilvl="0"/>
-    <w:lvlOverride w:ilvl="1"/>
-    <w:lvlOverride w:ilvl="2"/>
-    <w:lvlOverride w:ilvl="3"/>
-    <w:lvlOverride w:ilvl="4"/>
-    <w:lvlOverride w:ilvl="5"/>
-    <w:lvlOverride w:ilvl="6"/>
-    <w:lvlOverride w:ilvl="7"/>
-    <w:lvlOverride w:ilvl="8"/>
   </w:num>
   <w:numIdMacAtCleanup w:val="24"/>
 </w:numbering>
@@ -8643,6 +8703,7 @@
   <w:style w:type="character" w:default="1" w:styleId="Tipodeletrapredefinidodopargrafo">
     <w:name w:val="Default Paragraph Font"/>
     <w:uiPriority w:val="1"/>
+    <w:semiHidden/>
     <w:unhideWhenUsed/>
   </w:style>
   <w:style w:type="table" w:default="1" w:styleId="Tabelanormal">

</xml_diff>